<commit_message>
docs: finalize student details in KT01-KT12 reports
Co-authored-by: Cursor <cursoragent@cursor.com>
</commit_message>
<xml_diff>
--- a/reports/KT01.docx
+++ b/reports/KT01.docx
@@ -27,7 +27,7 @@
           <w:b w:val="0"/>
           <w:sz w:val="24"/>
         </w:rPr>
-        <w:t>Учебное заведение: ______________________________</w:t>
+        <w:t>Студент: Прилепов Никита Алексеевич</w:t>
       </w:r>
     </w:p>
     <w:p>
@@ -41,35 +41,7 @@
           <w:b w:val="0"/>
           <w:sz w:val="24"/>
         </w:rPr>
-        <w:t>Студент: _______________________________________</w:t>
-      </w:r>
-    </w:p>
-    <w:p>
-      <w:pPr>
-        <w:spacing w:after="120" w:line="276" w:lineRule="auto"/>
-        <w:jc w:val="center"/>
-      </w:pPr>
-      <w:r>
-        <w:rPr>
-          <w:rFonts w:ascii="Times New Roman" w:hAnsi="Times New Roman" w:eastAsia="Times New Roman"/>
-          <w:b w:val="0"/>
-          <w:sz w:val="24"/>
-        </w:rPr>
-        <w:t>Преподаватель: _________________________________</w:t>
-      </w:r>
-    </w:p>
-    <w:p>
-      <w:pPr>
-        <w:spacing w:after="120" w:line="276" w:lineRule="auto"/>
-        <w:jc w:val="center"/>
-      </w:pPr>
-      <w:r>
-        <w:rPr>
-          <w:rFonts w:ascii="Times New Roman" w:hAnsi="Times New Roman" w:eastAsia="Times New Roman"/>
-          <w:b w:val="0"/>
-          <w:sz w:val="24"/>
-        </w:rPr>
-        <w:t>Группа: ________________________________________</w:t>
+        <w:t>Группа: 4P1.23</w:t>
       </w:r>
     </w:p>
     <w:p>

</xml_diff>

<commit_message>
docs: rewrite KT01-KT12 reports in natural student language
Co-authored-by: Cursor <cursoragent@cursor.com>
</commit_message>
<xml_diff>
--- a/reports/KT01.docx
+++ b/reports/KT01.docx
@@ -108,7 +108,7 @@
           <w:b/>
           <w:sz w:val="28"/>
         </w:rPr>
-        <w:t>1. Цель работы</w:t>
+        <w:t>Зачем я это делал</w:t>
       </w:r>
     </w:p>
     <w:p>
@@ -121,7 +121,7 @@
           <w:b w:val="0"/>
           <w:sz w:val="24"/>
         </w:rPr>
-        <w:t>Цель контрольной точки №1 — освоить базовый запуск Selenium WebDriver 4 в браузере Google Chrome, открыть сайт https://ya.ru и подтвердить успешную навигацию проверяемыми утверждениями (assertions).</w:t>
+        <w:t>Первая КТ — просто поднять Selenium WebDriver 4 и убедиться, что браузер реально открывается из Python. Задача небольшая: Chrome, переход на https://ya.ru, пара assertions и скриншот. Без Page Object и сложных сценариев — сначала проверить, что связка pytest + Selenium вообще живая.</w:t>
       </w:r>
     </w:p>
     <w:p>
@@ -134,7 +134,7 @@
           <w:b/>
           <w:sz w:val="28"/>
         </w:rPr>
-        <w:t>2. Требования задания</w:t>
+        <w:t>Что требовалось по заданию</w:t>
       </w:r>
     </w:p>
     <w:p>
@@ -147,7 +147,7 @@
           <w:b w:val="0"/>
           <w:sz w:val="24"/>
         </w:rPr>
-        <w:t>Согласно постановке задания (КТ 01, 5 баллов):</w:t>
+        <w:t>КТ 01, 5 баллов. По сути:</w:t>
       </w:r>
     </w:p>
     <w:p>
@@ -160,7 +160,7 @@
           <w:b w:val="0"/>
           <w:sz w:val="24"/>
         </w:rPr>
-        <w:t>• реализовать автотест на Python с использованием pytest и Selenium 4;</w:t>
+        <w:t>• автотест на Python (pytest + Selenium 4);</w:t>
       </w:r>
     </w:p>
     <w:p>
@@ -173,7 +173,7 @@
           <w:b w:val="0"/>
           <w:sz w:val="24"/>
         </w:rPr>
-        <w:t>• запустить Google Chrome через WebDriver;</w:t>
+        <w:t>• запуск Google Chrome через WebDriver;</w:t>
       </w:r>
     </w:p>
     <w:p>
@@ -186,7 +186,7 @@
           <w:b w:val="0"/>
           <w:sz w:val="24"/>
         </w:rPr>
-        <w:t>• открыть адрес https://ya.ru;</w:t>
+        <w:t>• открыть https://ya.ru;</w:t>
       </w:r>
     </w:p>
     <w:p>
@@ -199,7 +199,7 @@
           <w:b w:val="0"/>
           <w:sz w:val="24"/>
         </w:rPr>
-        <w:t>• проверить успешность перехода осмысленными assertions;</w:t>
+        <w:t>• проверить переход нормальными assertions;</w:t>
       </w:r>
     </w:p>
     <w:p>
@@ -212,7 +212,7 @@
           <w:b w:val="0"/>
           <w:sz w:val="24"/>
         </w:rPr>
-        <w:t>• зафиксировать результат реальным скриншотом и отчётом.</w:t>
+        <w:t>• сохранить скриншот и оформить отчёт.</w:t>
       </w:r>
     </w:p>
     <w:p>
@@ -225,7 +225,7 @@
           <w:b/>
           <w:sz w:val="28"/>
         </w:rPr>
-        <w:t>3. Программное обеспечение и тестовая среда</w:t>
+        <w:t>На чём гонял</w:t>
       </w:r>
     </w:p>
     <w:p>
@@ -238,7 +238,7 @@
           <w:b w:val="0"/>
           <w:sz w:val="24"/>
         </w:rPr>
-        <w:t>• Операционная система: Windows 11 (10.0.26100)</w:t>
+        <w:t>• ОС: Windows 11 (10.0.26100)</w:t>
       </w:r>
     </w:p>
     <w:p>
@@ -251,7 +251,7 @@
           <w:b w:val="0"/>
           <w:sz w:val="24"/>
         </w:rPr>
-        <w:t>• Интерпретатор: Python 3.13.9</w:t>
+        <w:t>• Python 3.13.9</w:t>
       </w:r>
     </w:p>
     <w:p>
@@ -264,7 +264,7 @@
           <w:b w:val="0"/>
           <w:sz w:val="24"/>
         </w:rPr>
-        <w:t>• Фреймворк тестов: pytest 8.4.2</w:t>
+        <w:t>• pytest 8.4.2</w:t>
       </w:r>
     </w:p>
     <w:p>
@@ -277,7 +277,7 @@
           <w:b w:val="0"/>
           <w:sz w:val="24"/>
         </w:rPr>
-        <w:t>• Библиотека автоматизации: Selenium 4.50.0</w:t>
+        <w:t>• Selenium 4.50.0</w:t>
       </w:r>
     </w:p>
     <w:p>
@@ -290,7 +290,7 @@
           <w:b w:val="0"/>
           <w:sz w:val="24"/>
         </w:rPr>
-        <w:t>• Браузер: Google Chrome 154.0.8037.98</w:t>
+        <w:t>• Google Chrome 154.0.8037.98</w:t>
       </w:r>
     </w:p>
     <w:p>
@@ -303,7 +303,7 @@
           <w:b w:val="0"/>
           <w:sz w:val="24"/>
         </w:rPr>
-        <w:t>• Управление драйвером: Selenium Manager (в составе Selenium 4)</w:t>
+        <w:t>• драйвер подтянул Selenium Manager (идёт с Selenium 4)</w:t>
       </w:r>
     </w:p>
     <w:p>
@@ -316,7 +316,7 @@
           <w:b w:val="0"/>
           <w:sz w:val="24"/>
         </w:rPr>
-        <w:t>• Целевой URL: https://ya.ru</w:t>
+        <w:t>• URL: https://ya.ru</w:t>
       </w:r>
     </w:p>
     <w:p>
@@ -329,7 +329,7 @@
           <w:b w:val="0"/>
           <w:sz w:val="24"/>
         </w:rPr>
-        <w:t>• Каталог автотеста: selenium/</w:t>
+        <w:t>• код лежит в selenium/</w:t>
       </w:r>
     </w:p>
     <w:p>
@@ -342,7 +342,7 @@
           <w:b/>
           <w:sz w:val="28"/>
         </w:rPr>
-        <w:t>4. Установка и порядок выполнения</w:t>
+        <w:t>Как ставил и запускал</w:t>
       </w:r>
     </w:p>
     <w:p>
@@ -355,7 +355,7 @@
           <w:b w:val="0"/>
           <w:sz w:val="24"/>
         </w:rPr>
-        <w:t>Подготовка виртуального окружения и зависимостей:</w:t>
+        <w:t>Сначала venv и зависимости:</w:t>
       </w:r>
     </w:p>
     <w:p>
@@ -420,7 +420,7 @@
           <w:b w:val="0"/>
           <w:sz w:val="24"/>
         </w:rPr>
-        <w:t>Запуск теста КТ 01:</w:t>
+        <w:t>Сам тест КТ 01:</w:t>
       </w:r>
     </w:p>
     <w:p>
@@ -446,7 +446,7 @@
           <w:b w:val="0"/>
           <w:sz w:val="24"/>
         </w:rPr>
-        <w:t>Параметр --browser=chrome выбирает браузер через общую фикстуру. Скриншот сохраняется в файл screenshots/kt01/ya_ru_opened.png.</w:t>
+        <w:t>Через --browser=chrome фикстура выбирает браузер. Скриншот пишется в screenshots/kt01/ya_ru_opened.png.</w:t>
       </w:r>
     </w:p>
     <w:p>
@@ -459,7 +459,7 @@
           <w:b/>
           <w:sz w:val="28"/>
         </w:rPr>
-        <w:t>5. Фикстура браузера и assertions</w:t>
+        <w:t>Фикстура и что именно проверяю</w:t>
       </w:r>
     </w:p>
     <w:p>
@@ -472,7 +472,7 @@
           <w:b w:val="0"/>
           <w:sz w:val="24"/>
         </w:rPr>
-        <w:t>Общая фикстура driver создаётся в selenium/conftest.py. Она читает CLI-опцию --browser, запускает Chrome (по умолчанию), задаёт таймауты загрузки страницы (30 с), неявного ожидания (5 с) и выполнения скриптов (30 с), после теста корректно закрывает WebDriver. Фикстура save_screenshot сохраняет PNG в каталог screenshots/&lt;кт&gt;/.</w:t>
+        <w:t>Фикстура driver — в selenium/conftest.py. Читает --browser, по умолчанию стартует Chrome, выставляет page load 30 с, implicit wait 5 с, script timeout 30 с, в finally зовёт quit(). save_screenshot кладёт PNG в screenshots/&lt;кт&gt;/.</w:t>
       </w:r>
     </w:p>
     <w:p>
@@ -485,7 +485,7 @@
           <w:b w:val="0"/>
           <w:sz w:val="24"/>
         </w:rPr>
-        <w:t>Фрагмент фикстуры (сокращённо):</w:t>
+        <w:t>Кусок фикстуры:</w:t>
       </w:r>
     </w:p>
     <w:p>
@@ -693,7 +693,7 @@
           <w:b w:val="0"/>
           <w:sz w:val="24"/>
         </w:rPr>
-        <w:t>Тест test_open_ya_ru выполняет переход на https://ya.ru и проверяет: 1) итоговый host относится к семейству ya.ru / yandex (с учётом возможного редиректа); 2) заголовок страницы непустой; 3) document.readyState равен complete; 4) скриншот создан и имеет ненулевой размер.</w:t>
+        <w:t>test_open_ya_ru идёт на https://ya.ru и смотрит четыре вещи: host — ya.ru или yandex (редирект бывает), title не пустой, document.readyState == complete, скриншот существует и размер &gt; 0.</w:t>
       </w:r>
     </w:p>
     <w:p>
@@ -706,7 +706,7 @@
           <w:b w:val="0"/>
           <w:sz w:val="24"/>
         </w:rPr>
-        <w:t>Фрагмент теста (сокращённо):</w:t>
+        <w:t>Кусок теста:</w:t>
       </w:r>
     </w:p>
     <w:p>
@@ -875,7 +875,7 @@
           <w:b/>
           <w:sz w:val="28"/>
         </w:rPr>
-        <w:t>6. Фактический результат выполнения</w:t>
+        <w:t>Что получилось на прогоне</w:t>
       </w:r>
     </w:p>
     <w:p>
@@ -888,7 +888,7 @@
           <w:b w:val="0"/>
           <w:sz w:val="24"/>
         </w:rPr>
-        <w:t>Повторный прогон после добавления pytest.ini (регистрация маркера kt01) выполнен 2026-10-09. Предупреждений нет. Результат: PASSED.</w:t>
+        <w:t>После того как добавил pytest.ini (маркер kt01), прогнал ещё раз 2026-10-09. Предупреждений не было. Результат — PASSED.</w:t>
       </w:r>
     </w:p>
     <w:p>
@@ -1044,7 +1044,7 @@
           <w:b w:val="0"/>
           <w:sz w:val="24"/>
         </w:rPr>
-        <w:t>Итог: 1 passed за 4.99 с. Exit code: 0.</w:t>
+        <w:t>Итог: 1 passed in 4.99s. Exit code: 0.</w:t>
       </w:r>
     </w:p>
     <w:p>
@@ -1057,7 +1057,7 @@
           <w:b/>
           <w:sz w:val="28"/>
         </w:rPr>
-        <w:t>7. Скриншот фактического запуска</w:t>
+        <w:t>Скриншот</w:t>
       </w:r>
     </w:p>
     <w:p>
@@ -1070,7 +1070,7 @@
           <w:b w:val="0"/>
           <w:sz w:val="24"/>
         </w:rPr>
-        <w:t>Ниже приведён подлинный скриншот, сделанный WebDriver после успешной навигации на https://ya.ru (файл screenshots/kt01/ya_ru_opened.png).</w:t>
+        <w:t>Скриншот снял сам WebDriver после открытия ya.ru — файл screenshots/kt01/ya_ru_opened.png.</w:t>
       </w:r>
     </w:p>
     <w:p>
@@ -1132,7 +1132,7 @@
           <w:b/>
           <w:sz w:val="28"/>
         </w:rPr>
-        <w:t>8. Заключение</w:t>
+        <w:t>Заключение</w:t>
       </w:r>
     </w:p>
     <w:p>
@@ -1145,7 +1145,7 @@
           <w:b w:val="0"/>
           <w:sz w:val="24"/>
         </w:rPr>
-        <w:t>Контрольная точка №1 выполнена: настроены зависимости pytest и Selenium 4, реализована переиспользуемая фикстура браузера с параметром --browser=chrome, автотест успешно открывает https://ya.ru и подтверждает корректную навигацию assertions. Получены воспроизводимые команды запуска, лог PASS и реальный скриншот. Отчётный файл DOCX сформирован на основании фактического прогона.</w:t>
+        <w:t>Для первой КТ этого хватило: venv, Selenium 4, фикстура с --browser=chrome, один тест на https://ya.ru. Прогон дал 1 passed in 4.99s, скриншот ya_ru_opened.png на месте. Дальше уже можно наращивать сценарии — база для WebDriver у меня есть.</w:t>
       </w:r>
     </w:p>
     <w:p>
@@ -1158,11 +1158,11 @@
           <w:b w:val="0"/>
           <w:sz w:val="24"/>
         </w:rPr>
-        <w:t>Ограничения: внешний сайт может менять вёрстку или показывать баннеры; тест проверяет факт успешной загрузки, а не полный функционал поиска.</w:t>
+        <w:t>Минус: ya.ru может менять вёрстку и показывать баннеры. Мой тест смотрит только на факт загрузки, а не на поиск или весь UI.</w:t>
       </w:r>
     </w:p>
     <w:sectPr>
-      <w:pgSz w:w="12240" w:h="15840"/>
+      <w:pgSz w:w="11906" w:h="16838"/>
       <w:pgMar w:top="1134" w:right="850" w:bottom="1134" w:left="1417" w:header="720" w:footer="720" w:gutter="0"/>
       <w:cols w:space="720"/>
       <w:docGrid w:linePitch="360"/>

</xml_diff>